<commit_message>
feat: Nang cap So tay To truong theo 4 cong van cap truong va xuat bao cao 4 cap do Tuan, Thang, Hoc ky, Ca nam
</commit_message>
<xml_diff>
--- a/data/BAO_CAO_SO_KET_HDCM_THANG_09.docx
+++ b/data/BAO_CAO_SO_KET_HDCM_THANG_09.docx
@@ -5811,7 +5811,7 @@
           <w:sz w:val="22"/>
           <w:rFonts w:ascii="Times New Roman" w:hAnsi="Times New Roman" w:cs="Times New Roman"/>
         </w:rPr>
-        <w:t>Đa số GV lên lớp tích cực sử dụng ĐDDH (0 lượt), dạy UD CNTT (216 lượt), cụ thể:</w:t>
+        <w:t>Đa số GV lên lớp tích cực sử dụng ĐDDH (0 lượt), dạy UD CNTT (160 lượt), cụ thể:</w:t>
       </w:r>
     </w:p>
     <w:tbl>
@@ -6299,7 +6299,7 @@
                 <w:sz w:val="20"/>
                 <w:rFonts w:ascii="Times New Roman" w:hAnsi="Times New Roman" w:cs="Times New Roman"/>
               </w:rPr>
-              <w:t>12</w:t>
+              <w:t>20</w:t>
             </w:r>
           </w:p>
         </w:tc>
@@ -6443,7 +6443,7 @@
                 <w:sz w:val="20"/>
                 <w:rFonts w:ascii="Times New Roman" w:hAnsi="Times New Roman" w:cs="Times New Roman"/>
               </w:rPr>
-              <w:t>52</w:t>
+              <w:t>20</w:t>
             </w:r>
           </w:p>
         </w:tc>
@@ -6731,7 +6731,7 @@
                 <w:sz w:val="20"/>
                 <w:rFonts w:ascii="Times New Roman" w:hAnsi="Times New Roman" w:cs="Times New Roman"/>
               </w:rPr>
-              <w:t>36</w:t>
+              <w:t>20</w:t>
             </w:r>
           </w:p>
         </w:tc>
@@ -7307,7 +7307,7 @@
                 <w:sz w:val="20"/>
                 <w:rFonts w:ascii="Times New Roman" w:hAnsi="Times New Roman" w:cs="Times New Roman"/>
               </w:rPr>
-              <w:t>36</w:t>
+              <w:t>20</w:t>
             </w:r>
           </w:p>
         </w:tc>
@@ -7597,7 +7597,7 @@
                 <w:sz w:val="20"/>
                 <w:rFonts w:ascii="Times New Roman" w:hAnsi="Times New Roman" w:cs="Times New Roman"/>
               </w:rPr>
-              <w:t>Lê Văn Thắng</w:t>
+              <w:t>Phạm Thị Cúc</w:t>
             </w:r>
           </w:p>
         </w:tc>
@@ -7633,7 +7633,7 @@
                 <w:sz w:val="20"/>
                 <w:rFonts w:ascii="Times New Roman" w:hAnsi="Times New Roman" w:cs="Times New Roman"/>
               </w:rPr>
-              <w:t>7A1</w:t>
+              <w:t>9A2</w:t>
             </w:r>
           </w:p>
         </w:tc>
@@ -7651,7 +7651,7 @@
                 <w:sz w:val="20"/>
                 <w:rFonts w:ascii="Times New Roman" w:hAnsi="Times New Roman" w:cs="Times New Roman"/>
               </w:rPr>
-              <w:t>23/09/2026</w:t>
+              <w:t>24/09/2026</w:t>
             </w:r>
           </w:p>
         </w:tc>
@@ -7669,7 +7669,7 @@
                 <w:sz w:val="20"/>
                 <w:rFonts w:ascii="Times New Roman" w:hAnsi="Times New Roman" w:cs="Times New Roman"/>
               </w:rPr>
-              <w:t>Bảng HTTN các nguyên tố hóa học</w:t>
+              <w:t>Các qui luật duy trền của Mendel</w:t>
             </w:r>
           </w:p>
         </w:tc>
@@ -7725,7 +7725,7 @@
                 <w:sz w:val="20"/>
                 <w:rFonts w:ascii="Times New Roman" w:hAnsi="Times New Roman" w:cs="Times New Roman"/>
               </w:rPr>
-              <w:t>Phạm Thị Cúc</w:t>
+              <w:t>Lê Văn Thắng</w:t>
             </w:r>
           </w:p>
         </w:tc>
@@ -7761,7 +7761,7 @@
                 <w:sz w:val="20"/>
                 <w:rFonts w:ascii="Times New Roman" w:hAnsi="Times New Roman" w:cs="Times New Roman"/>
               </w:rPr>
-              <w:t>9A2</w:t>
+              <w:t>7A1</w:t>
             </w:r>
           </w:p>
         </w:tc>
@@ -7779,7 +7779,7 @@
                 <w:sz w:val="20"/>
                 <w:rFonts w:ascii="Times New Roman" w:hAnsi="Times New Roman" w:cs="Times New Roman"/>
               </w:rPr>
-              <w:t>24/09/2026</w:t>
+              <w:t>23/09/2026</w:t>
             </w:r>
           </w:p>
         </w:tc>
@@ -7797,7 +7797,7 @@
                 <w:sz w:val="20"/>
                 <w:rFonts w:ascii="Times New Roman" w:hAnsi="Times New Roman" w:cs="Times New Roman"/>
               </w:rPr>
-              <w:t>Các qui luật duy trền của Mendel</w:t>
+              <w:t>Bảng HTTN các nguyên tố hóa học</w:t>
             </w:r>
           </w:p>
         </w:tc>
@@ -8816,7 +8816,7 @@
                 <w:sz w:val="20"/>
                 <w:rFonts w:ascii="Times New Roman" w:hAnsi="Times New Roman" w:cs="Times New Roman"/>
               </w:rPr>
-              <w:t>Lê Văn Thắng</w:t>
+              <w:t>Phạm Thị Cúc</w:t>
             </w:r>
           </w:p>
         </w:tc>
@@ -8977,7 +8977,7 @@
                 <w:sz w:val="20"/>
                 <w:rFonts w:ascii="Times New Roman" w:hAnsi="Times New Roman" w:cs="Times New Roman"/>
               </w:rPr>
-              <w:t>Hội thi PCMT</w:t>
+              <w:t>Sáng tạo thanh thiếu niên nhi đồng</w:t>
             </w:r>
           </w:p>
         </w:tc>
@@ -9102,7 +9102,7 @@
                 <w:sz w:val="20"/>
                 <w:rFonts w:ascii="Times New Roman" w:hAnsi="Times New Roman" w:cs="Times New Roman"/>
               </w:rPr>
-              <w:t>Phạm Thị Cúc</w:t>
+              <w:t>Lê Văn Thắng</w:t>
             </w:r>
           </w:p>
         </w:tc>
@@ -9120,7 +9120,7 @@
                 <w:sz w:val="20"/>
                 <w:rFonts w:ascii="Times New Roman" w:hAnsi="Times New Roman" w:cs="Times New Roman"/>
               </w:rPr>
-              <w:t>Sáng tạo thanh thiếu niên nhi đồng</w:t>
+              <w:t>Hội thi PCMT</w:t>
             </w:r>
           </w:p>
         </w:tc>

</xml_diff>